<commit_message>
docs: pendientes para el director, versión 2 con historial de cambios
Extensión medida con la paginación de Word (86 páginas de cuerpo, 221 en
total), resaltado en amarillo y decisión 7 actualizados tras retirar las
instrucciones de cada sección, y sección de historial con las cifras de la
versión 1.

Co-Authored-By: Claude Opus 5.5 <noreply@anthropic.com>
</commit_message>
<xml_diff>
--- a/itz/tesis/Pendientes para revisión con el director.docx
+++ b/itz/tesis/Pendientes para revisión con el director.docx
@@ -27,7 +27,7 @@
         <w:t xml:space="preserve">Loom - Tesis v04.docx</w:t>
       </w:r>
       <w:r>
-        <w:t xml:space="preserve">. Corte: 3 de octubre de 2026.</w:t>
+        <w:t xml:space="preserve">. Corte: 3 de octubre de 2026. Versión 2 de este documento; el historial de cambios está al final.</w:t>
       </w:r>
     </w:p>
     <w:p>
@@ -72,7 +72,7 @@
         <w:spacing w:after="60"/>
       </w:pPr>
       <w:r>
-        <w:t xml:space="preserve">Extensión: unas 81 cuartillas sin anexos ni referencias y unas 162 con ellos. La guía pide 80 como mínimo.</w:t>
+        <w:t xml:space="preserve">Extensión, según la paginación de Word: 86 páginas del cuerpo (de la introducción al capítulo 6), 7 de referencias y 102 de anexos, 221 en total. La guía pide 80 cuartillas como mínimo.</w:t>
       </w:r>
     </w:p>
     <w:p>
@@ -85,7 +85,7 @@
         <w:spacing w:after="60"/>
       </w:pPr>
       <w:r>
-        <w:t xml:space="preserve">Referencias: 61, en formato IEEE, verificadas una por una contra su fuente.</w:t>
+        <w:t xml:space="preserve">Figuras: 12 diagramas del problema, del diseño de la investigación y de la solución, además de las capturas de las corridas; los índices de figuras (56), gráficas (4) y tablas (34) están completos.</w:t>
       </w:r>
     </w:p>
     <w:p>
@@ -98,6 +98,19 @@
         <w:spacing w:after="60"/>
       </w:pPr>
       <w:r>
+        <w:t xml:space="preserve">Referencias: 61, en formato IEEE, verificadas una por una contra su fuente.</w:t>
+      </w:r>
+    </w:p>
+    <w:p>
+      <w:pPr>
+        <w:pStyle w:val="ListParagraph"/>
+        <w:numPr>
+          <w:ilvl w:val="0"/>
+          <w:numId w:val="2"/>
+        </w:numPr>
+        <w:spacing w:after="60"/>
+      </w:pPr>
+      <w:r>
         <w:t xml:space="preserve">Cifras: 87 de los capítulos 4 a 6 se recalculan desde la evidencia versionada y todas coinciden (</w:t>
       </w:r>
       <w:r>
@@ -257,7 +270,7 @@
         <w:spacing w:after="120"/>
       </w:pPr>
       <w:r>
-        <w:t xml:space="preserve">Lo resaltado en amarillo no es texto de la tesis: son las instrucciones de la plantilla institucional (85 párrafos), la guía de la sección de agradecimientos, los datos de portada y oficio por completar, y una nota de trabajo en el apartado 1.6.</w:t>
+        <w:t xml:space="preserve">Lo resaltado en amarillo no es texto de la tesis: son las páginas de la guía institucional antes del índice, la guía de la sección de agradecimientos, los datos de portada y oficio por completar, y una nota de trabajo en el apartado 1.6. Las instrucciones que la plantilla traía dentro de cada sección ya se retiraron.</w:t>
       </w:r>
     </w:p>
     <w:p>
@@ -1118,7 +1131,7 @@
                 <w:sz w:val="19"/>
                 <w:szCs w:val="19"/>
               </w:rPr>
-              <w:t xml:space="preserve">Instrucciones de la plantilla institucional (en amarillo).</w:t>
+              <w:t xml:space="preserve">Páginas de la guía institucional que siguen en amarillo antes del índice (concepto de tesis, competencias, formato del informe). Las instrucciones dentro de cada sección ya se retiraron.</w:t>
             </w:r>
           </w:p>
         </w:tc>
@@ -1497,7 +1510,7 @@
                 <w:sz w:val="19"/>
                 <w:szCs w:val="19"/>
               </w:rPr>
-              <w:t xml:space="preserve">Se cumple en los dos casos; basta confirmarlo.</w:t>
+              <w:t xml:space="preserve">Se cumple en los dos casos (86 páginas sin ellos); basta confirmarlo.</w:t>
             </w:r>
           </w:p>
         </w:tc>
@@ -1627,6 +1640,295 @@
         <w:t xml:space="preserve">.</w:t>
       </w:r>
     </w:p>
+    <w:p>
+      <w:pPr>
+        <w:pStyle w:val="Heading1"/>
+        <w:spacing w:after="120" w:before="240"/>
+      </w:pPr>
+      <w:r>
+        <w:t xml:space="preserve">7. Historial de cambios</w:t>
+      </w:r>
+    </w:p>
+    <w:tbl>
+      <w:tblPr>
+        <w:tblW w:type="dxa" w:w="9360"/>
+        <w:tblBorders>
+          <w:top w:val="single" w:color="auto" w:sz="4"/>
+          <w:left w:val="single" w:color="auto" w:sz="4"/>
+          <w:bottom w:val="single" w:color="auto" w:sz="4"/>
+          <w:right w:val="single" w:color="auto" w:sz="4"/>
+          <w:insideH w:val="single" w:color="auto" w:sz="4"/>
+          <w:insideV w:val="single" w:color="auto" w:sz="4"/>
+        </w:tblBorders>
+      </w:tblPr>
+      <w:tblGrid>
+        <w:gridCol w:w="3120"/>
+        <w:gridCol w:w="3120"/>
+        <w:gridCol w:w="3120"/>
+      </w:tblGrid>
+      <w:tr>
+        <w:trPr>
+          <w:tblHeader/>
+        </w:trPr>
+        <w:tc>
+          <w:tcPr>
+            <w:tcW w:type="dxa" w:w="3120"/>
+            <w:tcBorders>
+              <w:top w:val="single" w:color="BFBFBF" w:sz="4"/>
+              <w:left w:val="single" w:color="BFBFBF" w:sz="4"/>
+              <w:bottom w:val="single" w:color="BFBFBF" w:sz="4"/>
+              <w:right w:val="single" w:color="BFBFBF" w:sz="4"/>
+            </w:tcBorders>
+            <w:shd w:fill="1F3864" w:color="auto" w:val="clear"/>
+            <w:tcMar>
+              <w:top w:type="dxa" w:w="60"/>
+              <w:left w:type="dxa" w:w="100"/>
+              <w:bottom w:type="dxa" w:w="60"/>
+              <w:right w:type="dxa" w:w="100"/>
+            </w:tcMar>
+          </w:tcPr>
+          <w:p>
+            <w:r>
+              <w:rPr>
+                <w:b/>
+                <w:bCs/>
+                <w:color w:val="FFFFFF"/>
+                <w:sz w:val="19"/>
+                <w:szCs w:val="19"/>
+              </w:rPr>
+              <w:t xml:space="preserve">Versión</w:t>
+            </w:r>
+          </w:p>
+        </w:tc>
+        <w:tc>
+          <w:tcPr>
+            <w:tcW w:type="dxa" w:w="3120"/>
+            <w:tcBorders>
+              <w:top w:val="single" w:color="BFBFBF" w:sz="4"/>
+              <w:left w:val="single" w:color="BFBFBF" w:sz="4"/>
+              <w:bottom w:val="single" w:color="BFBFBF" w:sz="4"/>
+              <w:right w:val="single" w:color="BFBFBF" w:sz="4"/>
+            </w:tcBorders>
+            <w:shd w:fill="1F3864" w:color="auto" w:val="clear"/>
+            <w:tcMar>
+              <w:top w:type="dxa" w:w="60"/>
+              <w:left w:type="dxa" w:w="100"/>
+              <w:bottom w:type="dxa" w:w="60"/>
+              <w:right w:type="dxa" w:w="100"/>
+            </w:tcMar>
+          </w:tcPr>
+          <w:p>
+            <w:r>
+              <w:rPr>
+                <w:b/>
+                <w:bCs/>
+                <w:color w:val="FFFFFF"/>
+                <w:sz w:val="19"/>
+                <w:szCs w:val="19"/>
+              </w:rPr>
+              <w:t xml:space="preserve">Fecha</w:t>
+            </w:r>
+          </w:p>
+        </w:tc>
+        <w:tc>
+          <w:tcPr>
+            <w:tcW w:type="dxa" w:w="3120"/>
+            <w:tcBorders>
+              <w:top w:val="single" w:color="BFBFBF" w:sz="4"/>
+              <w:left w:val="single" w:color="BFBFBF" w:sz="4"/>
+              <w:bottom w:val="single" w:color="BFBFBF" w:sz="4"/>
+              <w:right w:val="single" w:color="BFBFBF" w:sz="4"/>
+            </w:tcBorders>
+            <w:shd w:fill="1F3864" w:color="auto" w:val="clear"/>
+            <w:tcMar>
+              <w:top w:type="dxa" w:w="60"/>
+              <w:left w:type="dxa" w:w="100"/>
+              <w:bottom w:type="dxa" w:w="60"/>
+              <w:right w:type="dxa" w:w="100"/>
+            </w:tcMar>
+          </w:tcPr>
+          <w:p>
+            <w:r>
+              <w:rPr>
+                <w:b/>
+                <w:bCs/>
+                <w:color w:val="FFFFFF"/>
+                <w:sz w:val="19"/>
+                <w:szCs w:val="19"/>
+              </w:rPr>
+              <w:t xml:space="preserve">Cambios</w:t>
+            </w:r>
+          </w:p>
+        </w:tc>
+      </w:tr>
+      <w:tr>
+        <w:trPr>
+          <w:tblHeader w:val="off"/>
+        </w:trPr>
+        <w:tc>
+          <w:tcPr>
+            <w:tcW w:type="dxa" w:w="3120"/>
+            <w:tcBorders>
+              <w:top w:val="single" w:color="BFBFBF" w:sz="4"/>
+              <w:left w:val="single" w:color="BFBFBF" w:sz="4"/>
+              <w:bottom w:val="single" w:color="BFBFBF" w:sz="4"/>
+              <w:right w:val="single" w:color="BFBFBF" w:sz="4"/>
+            </w:tcBorders>
+            <w:tcMar>
+              <w:top w:type="dxa" w:w="60"/>
+              <w:left w:type="dxa" w:w="100"/>
+              <w:bottom w:type="dxa" w:w="60"/>
+              <w:right w:type="dxa" w:w="100"/>
+            </w:tcMar>
+          </w:tcPr>
+          <w:p>
+            <w:r>
+              <w:rPr>
+                <w:sz w:val="19"/>
+                <w:szCs w:val="19"/>
+              </w:rPr>
+              <w:t xml:space="preserve">1</w:t>
+            </w:r>
+          </w:p>
+        </w:tc>
+        <w:tc>
+          <w:tcPr>
+            <w:tcW w:type="dxa" w:w="3120"/>
+            <w:tcBorders>
+              <w:top w:val="single" w:color="BFBFBF" w:sz="4"/>
+              <w:left w:val="single" w:color="BFBFBF" w:sz="4"/>
+              <w:bottom w:val="single" w:color="BFBFBF" w:sz="4"/>
+              <w:right w:val="single" w:color="BFBFBF" w:sz="4"/>
+            </w:tcBorders>
+            <w:tcMar>
+              <w:top w:type="dxa" w:w="60"/>
+              <w:left w:type="dxa" w:w="100"/>
+              <w:bottom w:type="dxa" w:w="60"/>
+              <w:right w:type="dxa" w:w="100"/>
+            </w:tcMar>
+          </w:tcPr>
+          <w:p>
+            <w:r>
+              <w:rPr>
+                <w:sz w:val="19"/>
+                <w:szCs w:val="19"/>
+              </w:rPr>
+              <w:t xml:space="preserve">3 de octubre de 2026</w:t>
+            </w:r>
+          </w:p>
+        </w:tc>
+        <w:tc>
+          <w:tcPr>
+            <w:tcW w:type="dxa" w:w="3120"/>
+            <w:tcBorders>
+              <w:top w:val="single" w:color="BFBFBF" w:sz="4"/>
+              <w:left w:val="single" w:color="BFBFBF" w:sz="4"/>
+              <w:bottom w:val="single" w:color="BFBFBF" w:sz="4"/>
+              <w:right w:val="single" w:color="BFBFBF" w:sz="4"/>
+            </w:tcBorders>
+            <w:tcMar>
+              <w:top w:type="dxa" w:w="60"/>
+              <w:left w:type="dxa" w:w="100"/>
+              <w:bottom w:type="dxa" w:w="60"/>
+              <w:right w:type="dxa" w:w="100"/>
+            </w:tcMar>
+          </w:tcPr>
+          <w:p>
+            <w:r>
+              <w:rPr>
+                <w:sz w:val="19"/>
+                <w:szCs w:val="19"/>
+              </w:rPr>
+              <w:t xml:space="preserve">Primera versión: estado del documento, resultados principales y diez decisiones.</w:t>
+            </w:r>
+          </w:p>
+        </w:tc>
+      </w:tr>
+      <w:tr>
+        <w:trPr>
+          <w:tblHeader w:val="off"/>
+        </w:trPr>
+        <w:tc>
+          <w:tcPr>
+            <w:tcW w:type="dxa" w:w="3120"/>
+            <w:tcBorders>
+              <w:top w:val="single" w:color="BFBFBF" w:sz="4"/>
+              <w:left w:val="single" w:color="BFBFBF" w:sz="4"/>
+              <w:bottom w:val="single" w:color="BFBFBF" w:sz="4"/>
+              <w:right w:val="single" w:color="BFBFBF" w:sz="4"/>
+            </w:tcBorders>
+            <w:tcMar>
+              <w:top w:type="dxa" w:w="60"/>
+              <w:left w:type="dxa" w:w="100"/>
+              <w:bottom w:type="dxa" w:w="60"/>
+              <w:right w:type="dxa" w:w="100"/>
+            </w:tcMar>
+          </w:tcPr>
+          <w:p>
+            <w:r>
+              <w:rPr>
+                <w:sz w:val="19"/>
+                <w:szCs w:val="19"/>
+              </w:rPr>
+              <w:t xml:space="preserve">2</w:t>
+            </w:r>
+          </w:p>
+        </w:tc>
+        <w:tc>
+          <w:tcPr>
+            <w:tcW w:type="dxa" w:w="3120"/>
+            <w:tcBorders>
+              <w:top w:val="single" w:color="BFBFBF" w:sz="4"/>
+              <w:left w:val="single" w:color="BFBFBF" w:sz="4"/>
+              <w:bottom w:val="single" w:color="BFBFBF" w:sz="4"/>
+              <w:right w:val="single" w:color="BFBFBF" w:sz="4"/>
+            </w:tcBorders>
+            <w:tcMar>
+              <w:top w:type="dxa" w:w="60"/>
+              <w:left w:type="dxa" w:w="100"/>
+              <w:bottom w:type="dxa" w:w="60"/>
+              <w:right w:type="dxa" w:w="100"/>
+            </w:tcMar>
+          </w:tcPr>
+          <w:p>
+            <w:r>
+              <w:rPr>
+                <w:sz w:val="19"/>
+                <w:szCs w:val="19"/>
+              </w:rPr>
+              <w:t xml:space="preserve">3 de octubre de 2026</w:t>
+            </w:r>
+          </w:p>
+        </w:tc>
+        <w:tc>
+          <w:tcPr>
+            <w:tcW w:type="dxa" w:w="3120"/>
+            <w:tcBorders>
+              <w:top w:val="single" w:color="BFBFBF" w:sz="4"/>
+              <w:left w:val="single" w:color="BFBFBF" w:sz="4"/>
+              <w:bottom w:val="single" w:color="BFBFBF" w:sz="4"/>
+              <w:right w:val="single" w:color="BFBFBF" w:sz="4"/>
+            </w:tcBorders>
+            <w:tcMar>
+              <w:top w:type="dxa" w:w="60"/>
+              <w:left w:type="dxa" w:w="100"/>
+              <w:bottom w:type="dxa" w:w="60"/>
+              <w:right w:type="dxa" w:w="100"/>
+            </w:tcMar>
+          </w:tcPr>
+          <w:p>
+            <w:r>
+              <w:rPr>
+                <w:sz w:val="19"/>
+                <w:szCs w:val="19"/>
+              </w:rPr>
+              <w:t xml:space="preserve">La extensión se mide con la paginación de Word (la versión 1 la estimaba por palabras: 81 cuartillas sin anexos ni referencias y 162 con ellos). Se retiraron de la tesis las instrucciones de cada sección, por lo que el amarillo ya no incluye los 85 párrafos de instrucciones que mencionaba la versión 1, y la decisión 7 queda acotada a las páginas de la guía. Se agregan los índices de figuras, gráficas y tablas y ocho diagramas nuevos.</w:t>
+            </w:r>
+          </w:p>
+        </w:tc>
+      </w:tr>
+    </w:tbl>
+    <w:p/>
     <w:sectPr>
       <w:pgSz w:w="12240" w:h="15840" w:orient="portrait"/>
       <w:pgMar w:top="1440" w:right="1440" w:bottom="1440" w:left="1440" w:header="708" w:footer="708" w:gutter="0"/>

</xml_diff>